<commit_message>
Episode 7 posted: player on the stumbling-block page, Episodes page, What's new, email links; Law pages can carry an episode
Co-Authored-By: Claude Opus 5.5 <noreply@anthropic.com>
</commit_message>
<xml_diff>
--- a/audio/episodes/youtube_links_for_email.docx
+++ b/audio/episodes/youtube_links_for_email.docx
@@ -3,7 +3,7 @@
 <w:document xmlns:wpc="http://schemas.microsoft.com/office/word/2010/wordprocessingCanvas" xmlns:mc="http://schemas.openxmlformats.org/markup-compatibility/2006" xmlns:o="urn:schemas-microsoft-com:office:office" xmlns:r="http://schemas.openxmlformats.org/officeDocument/2006/relationships" xmlns:m="http://schemas.openxmlformats.org/officeDocument/2006/math" xmlns:v="urn:schemas-microsoft-com:vml" xmlns:wp14="http://schemas.microsoft.com/office/word/2010/wordprocessingDrawing" xmlns:wp="http://schemas.openxmlformats.org/drawingml/2006/wordprocessingDrawing" xmlns:w10="urn:schemas-microsoft-com:office:word" xmlns:w="http://schemas.openxmlformats.org/wordprocessingml/2006/main" xmlns:w14="http://schemas.microsoft.com/office/word/2010/wordml" xmlns:w15="http://schemas.microsoft.com/office/word/2012/wordml" xmlns:wpg="http://schemas.microsoft.com/office/word/2010/wordprocessingGroup" xmlns:wpi="http://schemas.microsoft.com/office/word/2010/wordprocessingInk" xmlns:wne="http://schemas.microsoft.com/office/word/2006/wordml" xmlns:wps="http://schemas.microsoft.com/office/word/2010/wordprocessingShape" xmlns:cx="http://schemas.microsoft.com/office/drawing/2014/chartex" xmlns:cx1="http://schemas.microsoft.com/office/drawing/2015/9/8/chartex" xmlns:cx2="http://schemas.microsoft.com/office/drawing/2015/10/21/chartex" xmlns:cx3="http://schemas.microsoft.com/office/drawing/2016/5/9/chartex" xmlns:cx4="http://schemas.microsoft.com/office/drawing/2016/5/10/chartex" xmlns:cx5="http://schemas.microsoft.com/office/drawing/2016/5/11/chartex" xmlns:cx6="http://schemas.microsoft.com/office/drawing/2016/5/12/chartex" xmlns:cx7="http://schemas.microsoft.com/office/drawing/2016/5/13/chartex" xmlns:cx8="http://schemas.microsoft.com/office/drawing/2016/5/14/chartex" xmlns:aink="http://schemas.microsoft.com/office/drawing/2016/ink" xmlns:am3d="http://schemas.microsoft.com/office/drawing/2017/model3d" xmlns:w16cex="http://schemas.microsoft.com/office/word/2018/wordml/cex" xmlns:w16cid="http://schemas.microsoft.com/office/word/2016/wordml/cid" xmlns:w16="http://schemas.microsoft.com/office/word/2018/wordml" xmlns:w16sdtdh="http://schemas.microsoft.com/office/word/2020/wordml/sdtdatahash" xmlns:w16se="http://schemas.microsoft.com/office/word/2015/wordml/symex" mc:Ignorable="w14 w15 wp14">
   <w:body>
     <w:p>
-      <w:hyperlink w:history="1" r:id="rIdsvwsg0pvnvg961nuzdmsk">
+      <w:hyperlink w:history="1" r:id="rIdca8tkeo-z4sjs0zfuuobl">
         <w:r>
           <w:rPr>
             <w:rStyle w:val="Hyperlink"/>
@@ -27,14 +27,14 @@
     </w:p>
     <w:p>
       <w:r>
-        <w:t xml:space="preserve">There are six episodes, one for each story of sight given by Jesus in the Gospels, and a short trailer.</w:t>
+        <w:t xml:space="preserve">There are six episodes on the stories of sight given by Jesus in the Gospels, and a short trailer. Episode 7 begins a new series of four on the Law: what God commanded about the blind. The Law episodes have no imagined scenes.</w:t>
       </w:r>
     </w:p>
     <w:p>
       <w:r>
         <w:t xml:space="preserve">The full study, with every verse and source, is at </w:t>
       </w:r>
-      <w:hyperlink w:history="1" r:id="rIdlc6d2iafejwi1mmpplomo">
+      <w:hyperlink w:history="1" r:id="rIdsx5cywkou27pjdkbawfzg">
         <w:r>
           <w:rPr>
             <w:rStyle w:val="Hyperlink"/>
@@ -47,7 +47,7 @@
       <w:r>
         <w:t xml:space="preserve">Every episode can also be played or downloaded as an MP3 at </w:t>
       </w:r>
-      <w:hyperlink w:history="1" r:id="rId44olkv-xzlodwh4cpsggs">
+      <w:hyperlink w:history="1" r:id="rIdj9g6pjbxj3oehgbulou7k">
         <w:r>
           <w:rPr>
             <w:rStyle w:val="Hyperlink"/>
@@ -75,7 +75,7 @@
       </w:r>
     </w:p>
     <w:p>
-      <w:hyperlink w:history="1" r:id="rIdiuupvnbqjk6h1fu9p_dlu">
+      <w:hyperlink w:history="1" r:id="rIdkx57pmhf9eec7bhzss0xa">
         <w:r>
           <w:rPr>
             <w:rStyle w:val="Hyperlink"/>
@@ -98,7 +98,7 @@
       </w:r>
     </w:p>
     <w:p>
-      <w:hyperlink w:history="1" r:id="rIdtas2e3cafiwew16jg5aqx">
+      <w:hyperlink w:history="1" r:id="rId_m5yydfe4klh6mqrqga3m">
         <w:r>
           <w:rPr>
             <w:rStyle w:val="Hyperlink"/>
@@ -126,7 +126,7 @@
       </w:r>
     </w:p>
     <w:p>
-      <w:hyperlink w:history="1" r:id="rIddblznn4svxxy_cut3tdos">
+      <w:hyperlink w:history="1" r:id="rIdrox6n4ml4kuvdtbfh1yze">
         <w:r>
           <w:rPr>
             <w:rStyle w:val="Hyperlink"/>
@@ -154,7 +154,7 @@
       </w:r>
     </w:p>
     <w:p>
-      <w:hyperlink w:history="1" r:id="rIdm_qn5svv-te1xlqb5ahqz">
+      <w:hyperlink w:history="1" r:id="rIdpz-pgbhvuqvgthkduds1l">
         <w:r>
           <w:rPr>
             <w:rStyle w:val="Hyperlink"/>
@@ -182,7 +182,7 @@
       </w:r>
     </w:p>
     <w:p>
-      <w:hyperlink w:history="1" r:id="rIdq1wjmsgz2qtd5vevmagti">
+      <w:hyperlink w:history="1" r:id="rIddf7uqndqqnmx36hi8rtc8">
         <w:r>
           <w:rPr>
             <w:rStyle w:val="Hyperlink"/>
@@ -210,7 +210,7 @@
       </w:r>
     </w:p>
     <w:p>
-      <w:hyperlink w:history="1" r:id="rId17dqohvskawzoddhacldg">
+      <w:hyperlink w:history="1" r:id="rIdld3zvq7obgu6kghxtpuot">
         <w:r>
           <w:rPr>
             <w:rStyle w:val="Hyperlink"/>
@@ -238,7 +238,7 @@
       </w:r>
     </w:p>
     <w:p>
-      <w:hyperlink w:history="1" r:id="rIdfozjhkoeyyworgrdohcfe">
+      <w:hyperlink w:history="1" r:id="rId1pbvv8-rbszmce4xynx55">
         <w:r>
           <w:rPr>
             <w:rStyle w:val="Hyperlink"/>
@@ -266,12 +266,40 @@
       </w:r>
     </w:p>
     <w:p>
-      <w:hyperlink w:history="1" r:id="rId9w1jhehsquu2ephirwb2s">
+      <w:hyperlink w:history="1" r:id="rIdi2mlziv5hg3jzkg78eigq">
         <w:r>
           <w:rPr>
             <w:rStyle w:val="Hyperlink"/>
           </w:rPr>
           <w:t xml:space="preserve">https://youtu.be/or8s4SUiSHQ</w:t>
+        </w:r>
+      </w:hyperlink>
+    </w:p>
+    <w:p>
+      <w:pPr>
+        <w:pStyle w:val="Heading2"/>
+      </w:pPr>
+      <w:r>
+        <w:t xml:space="preserve">Episode 7: The Stumbling Block (Leviticus 19 and Deuteronomy 27)</w:t>
+      </w:r>
+    </w:p>
+    <w:p>
+      <w:r>
+        <w:t xml:space="preserve">About 22 minutes. The first of four on the Law.</w:t>
+      </w:r>
+    </w:p>
+    <w:p>
+      <w:r>
+        <w:t xml:space="preserve">One sentence of law, given at Sinai: you must not curse the deaf or place a stumbling block before the blind. Brian read it and stopped at one word. Is the law about a trip, or a fall? The Hebrew word, and every other place the Bible uses it, gives the answer.</w:t>
+      </w:r>
+    </w:p>
+    <w:p>
+      <w:hyperlink w:history="1" r:id="rIddih0rjmhtjfj4vdh4mdsv">
+        <w:r>
+          <w:rPr>
+            <w:rStyle w:val="Hyperlink"/>
+          </w:rPr>
+          <w:t xml:space="preserve">https://youtu.be/STQZntb-8II</w:t>
         </w:r>
       </w:hyperlink>
     </w:p>

</xml_diff>

<commit_message>
Episode 8 posted on the site (Unlisted on YouTube, not in the playlist until Brian has watched it with someone sighted)
Co-Authored-By: Claude Opus 5.5 <noreply@anthropic.com>
</commit_message>
<xml_diff>
--- a/audio/episodes/youtube_links_for_email.docx
+++ b/audio/episodes/youtube_links_for_email.docx
@@ -3,7 +3,7 @@
 <w:document xmlns:wpc="http://schemas.microsoft.com/office/word/2010/wordprocessingCanvas" xmlns:mc="http://schemas.openxmlformats.org/markup-compatibility/2006" xmlns:o="urn:schemas-microsoft-com:office:office" xmlns:r="http://schemas.openxmlformats.org/officeDocument/2006/relationships" xmlns:m="http://schemas.openxmlformats.org/officeDocument/2006/math" xmlns:v="urn:schemas-microsoft-com:vml" xmlns:wp14="http://schemas.microsoft.com/office/word/2010/wordprocessingDrawing" xmlns:wp="http://schemas.openxmlformats.org/drawingml/2006/wordprocessingDrawing" xmlns:w10="urn:schemas-microsoft-com:office:word" xmlns:w="http://schemas.openxmlformats.org/wordprocessingml/2006/main" xmlns:w14="http://schemas.microsoft.com/office/word/2010/wordml" xmlns:w15="http://schemas.microsoft.com/office/word/2012/wordml" xmlns:wpg="http://schemas.microsoft.com/office/word/2010/wordprocessingGroup" xmlns:wpi="http://schemas.microsoft.com/office/word/2010/wordprocessingInk" xmlns:wne="http://schemas.microsoft.com/office/word/2006/wordml" xmlns:wps="http://schemas.microsoft.com/office/word/2010/wordprocessingShape" xmlns:cx="http://schemas.microsoft.com/office/drawing/2014/chartex" xmlns:cx1="http://schemas.microsoft.com/office/drawing/2015/9/8/chartex" xmlns:cx2="http://schemas.microsoft.com/office/drawing/2015/10/21/chartex" xmlns:cx3="http://schemas.microsoft.com/office/drawing/2016/5/9/chartex" xmlns:cx4="http://schemas.microsoft.com/office/drawing/2016/5/10/chartex" xmlns:cx5="http://schemas.microsoft.com/office/drawing/2016/5/11/chartex" xmlns:cx6="http://schemas.microsoft.com/office/drawing/2016/5/12/chartex" xmlns:cx7="http://schemas.microsoft.com/office/drawing/2016/5/13/chartex" xmlns:cx8="http://schemas.microsoft.com/office/drawing/2016/5/14/chartex" xmlns:aink="http://schemas.microsoft.com/office/drawing/2016/ink" xmlns:am3d="http://schemas.microsoft.com/office/drawing/2017/model3d" xmlns:w16cex="http://schemas.microsoft.com/office/word/2018/wordml/cex" xmlns:w16cid="http://schemas.microsoft.com/office/word/2016/wordml/cid" xmlns:w16="http://schemas.microsoft.com/office/word/2018/wordml" xmlns:w16sdtdh="http://schemas.microsoft.com/office/word/2020/wordml/sdtdatahash" xmlns:w16se="http://schemas.microsoft.com/office/word/2015/wordml/symex" mc:Ignorable="w14 w15 wp14">
   <w:body>
     <w:p>
-      <w:hyperlink w:history="1" r:id="rIdca8tkeo-z4sjs0zfuuobl">
+      <w:hyperlink w:history="1" r:id="rIdhjs6ulsznud4vbwminnr2">
         <w:r>
           <w:rPr>
             <w:rStyle w:val="Hyperlink"/>
@@ -34,7 +34,7 @@
       <w:r>
         <w:t xml:space="preserve">The full study, with every verse and source, is at </w:t>
       </w:r>
-      <w:hyperlink w:history="1" r:id="rIdsx5cywkou27pjdkbawfzg">
+      <w:hyperlink w:history="1" r:id="rId7vh4xf4pnjf7s87ofbvuh">
         <w:r>
           <w:rPr>
             <w:rStyle w:val="Hyperlink"/>
@@ -47,7 +47,7 @@
       <w:r>
         <w:t xml:space="preserve">Every episode can also be played or downloaded as an MP3 at </w:t>
       </w:r>
-      <w:hyperlink w:history="1" r:id="rIdj9g6pjbxj3oehgbulou7k">
+      <w:hyperlink w:history="1" r:id="rIdoeaxtxb55avgt74wsby7_">
         <w:r>
           <w:rPr>
             <w:rStyle w:val="Hyperlink"/>
@@ -75,7 +75,7 @@
       </w:r>
     </w:p>
     <w:p>
-      <w:hyperlink w:history="1" r:id="rIdkx57pmhf9eec7bhzss0xa">
+      <w:hyperlink w:history="1" r:id="rIdbneefor_irki0d2gj7mtu">
         <w:r>
           <w:rPr>
             <w:rStyle w:val="Hyperlink"/>
@@ -98,7 +98,7 @@
       </w:r>
     </w:p>
     <w:p>
-      <w:hyperlink w:history="1" r:id="rId_m5yydfe4klh6mqrqga3m">
+      <w:hyperlink w:history="1" r:id="rIdqv3nz5cvpqwfswrsxk7r9">
         <w:r>
           <w:rPr>
             <w:rStyle w:val="Hyperlink"/>
@@ -126,7 +126,7 @@
       </w:r>
     </w:p>
     <w:p>
-      <w:hyperlink w:history="1" r:id="rIdrox6n4ml4kuvdtbfh1yze">
+      <w:hyperlink w:history="1" r:id="rIdvqpt1vda2cwijusa0cctr">
         <w:r>
           <w:rPr>
             <w:rStyle w:val="Hyperlink"/>
@@ -154,7 +154,7 @@
       </w:r>
     </w:p>
     <w:p>
-      <w:hyperlink w:history="1" r:id="rIdpz-pgbhvuqvgthkduds1l">
+      <w:hyperlink w:history="1" r:id="rIdewgxzzv4yvs9uo0n3g_yt">
         <w:r>
           <w:rPr>
             <w:rStyle w:val="Hyperlink"/>
@@ -182,7 +182,7 @@
       </w:r>
     </w:p>
     <w:p>
-      <w:hyperlink w:history="1" r:id="rIddf7uqndqqnmx36hi8rtc8">
+      <w:hyperlink w:history="1" r:id="rIdy7ijzyywwobq2hwss8usx">
         <w:r>
           <w:rPr>
             <w:rStyle w:val="Hyperlink"/>
@@ -210,7 +210,7 @@
       </w:r>
     </w:p>
     <w:p>
-      <w:hyperlink w:history="1" r:id="rIdld3zvq7obgu6kghxtpuot">
+      <w:hyperlink w:history="1" r:id="rIdz2spmy2bbrjy5urtfvixb">
         <w:r>
           <w:rPr>
             <w:rStyle w:val="Hyperlink"/>
@@ -238,7 +238,7 @@
       </w:r>
     </w:p>
     <w:p>
-      <w:hyperlink w:history="1" r:id="rId1pbvv8-rbszmce4xynx55">
+      <w:hyperlink w:history="1" r:id="rId0inadtz7aw86o4ifzzlxe">
         <w:r>
           <w:rPr>
             <w:rStyle w:val="Hyperlink"/>
@@ -266,7 +266,7 @@
       </w:r>
     </w:p>
     <w:p>
-      <w:hyperlink w:history="1" r:id="rIdi2mlziv5hg3jzkg78eigq">
+      <w:hyperlink w:history="1" r:id="rIdfmrwtnq4fyddsxfptftdf">
         <w:r>
           <w:rPr>
             <w:rStyle w:val="Hyperlink"/>
@@ -294,12 +294,40 @@
       </w:r>
     </w:p>
     <w:p>
-      <w:hyperlink w:history="1" r:id="rIddih0rjmhtjfj4vdh4mdsv">
+      <w:hyperlink w:history="1" r:id="rIdwspcx9xorrvhhgbyud2eh">
         <w:r>
           <w:rPr>
             <w:rStyle w:val="Hyperlink"/>
           </w:rPr>
           <w:t xml:space="preserve">https://youtu.be/STQZntb-8II</w:t>
+        </w:r>
+      </w:hyperlink>
+    </w:p>
+    <w:p>
+      <w:pPr>
+        <w:pStyle w:val="Heading2"/>
+      </w:pPr>
+      <w:r>
+        <w:t xml:space="preserve">Episode 8: The Servant's Eye (Exodus 21)</w:t>
+      </w:r>
+    </w:p>
+    <w:p>
+      <w:r>
+        <w:t xml:space="preserve">About 20 minutes. The second of four on the Law.</w:t>
+      </w:r>
+    </w:p>
+    <w:p>
+      <w:r>
+        <w:t xml:space="preserve">The only price the Bible ever puts on an eye. If a master blinds his servant, the servant goes free; if he knocks out a tooth, the servant goes free. Why should an eye and a tooth cost the same?</w:t>
+      </w:r>
+    </w:p>
+    <w:p>
+      <w:hyperlink w:history="1" r:id="rId2blinffk-8wyouiydwhdu">
+        <w:r>
+          <w:rPr>
+            <w:rStyle w:val="Hyperlink"/>
+          </w:rPr>
+          <w:t xml:space="preserve">https://youtu.be/GyuNAJZ8wgM</w:t>
         </w:r>
       </w:hyperlink>
     </w:p>

</xml_diff>

<commit_message>
Episode 9 posted on the site (Unlisted on YouTube, not in the playlist)
Co-Authored-By: Claude Opus 5.5 <noreply@anthropic.com>
</commit_message>
<xml_diff>
--- a/audio/episodes/youtube_links_for_email.docx
+++ b/audio/episodes/youtube_links_for_email.docx
@@ -3,7 +3,7 @@
 <w:document xmlns:wpc="http://schemas.microsoft.com/office/word/2010/wordprocessingCanvas" xmlns:mc="http://schemas.openxmlformats.org/markup-compatibility/2006" xmlns:o="urn:schemas-microsoft-com:office:office" xmlns:r="http://schemas.openxmlformats.org/officeDocument/2006/relationships" xmlns:m="http://schemas.openxmlformats.org/officeDocument/2006/math" xmlns:v="urn:schemas-microsoft-com:vml" xmlns:wp14="http://schemas.microsoft.com/office/word/2010/wordprocessingDrawing" xmlns:wp="http://schemas.openxmlformats.org/drawingml/2006/wordprocessingDrawing" xmlns:w10="urn:schemas-microsoft-com:office:word" xmlns:w="http://schemas.openxmlformats.org/wordprocessingml/2006/main" xmlns:w14="http://schemas.microsoft.com/office/word/2010/wordml" xmlns:w15="http://schemas.microsoft.com/office/word/2012/wordml" xmlns:wpg="http://schemas.microsoft.com/office/word/2010/wordprocessingGroup" xmlns:wpi="http://schemas.microsoft.com/office/word/2010/wordprocessingInk" xmlns:wne="http://schemas.microsoft.com/office/word/2006/wordml" xmlns:wps="http://schemas.microsoft.com/office/word/2010/wordprocessingShape" xmlns:cx="http://schemas.microsoft.com/office/drawing/2014/chartex" xmlns:cx1="http://schemas.microsoft.com/office/drawing/2015/9/8/chartex" xmlns:cx2="http://schemas.microsoft.com/office/drawing/2015/10/21/chartex" xmlns:cx3="http://schemas.microsoft.com/office/drawing/2016/5/9/chartex" xmlns:cx4="http://schemas.microsoft.com/office/drawing/2016/5/10/chartex" xmlns:cx5="http://schemas.microsoft.com/office/drawing/2016/5/11/chartex" xmlns:cx6="http://schemas.microsoft.com/office/drawing/2016/5/12/chartex" xmlns:cx7="http://schemas.microsoft.com/office/drawing/2016/5/13/chartex" xmlns:cx8="http://schemas.microsoft.com/office/drawing/2016/5/14/chartex" xmlns:aink="http://schemas.microsoft.com/office/drawing/2016/ink" xmlns:am3d="http://schemas.microsoft.com/office/drawing/2017/model3d" xmlns:w16cex="http://schemas.microsoft.com/office/word/2018/wordml/cex" xmlns:w16cid="http://schemas.microsoft.com/office/word/2016/wordml/cid" xmlns:w16="http://schemas.microsoft.com/office/word/2018/wordml" xmlns:w16sdtdh="http://schemas.microsoft.com/office/word/2020/wordml/sdtdatahash" xmlns:w16se="http://schemas.microsoft.com/office/word/2015/wordml/symex" mc:Ignorable="w14 w15 wp14">
   <w:body>
     <w:p>
-      <w:hyperlink w:history="1" r:id="rIdhjs6ulsznud4vbwminnr2">
+      <w:hyperlink w:history="1" r:id="rIdlibmhlpeof1dyb8g7jn1k">
         <w:r>
           <w:rPr>
             <w:rStyle w:val="Hyperlink"/>
@@ -34,7 +34,7 @@
       <w:r>
         <w:t xml:space="preserve">The full study, with every verse and source, is at </w:t>
       </w:r>
-      <w:hyperlink w:history="1" r:id="rId7vh4xf4pnjf7s87ofbvuh">
+      <w:hyperlink w:history="1" r:id="rId7ykyhr77whk6cujsnflwo">
         <w:r>
           <w:rPr>
             <w:rStyle w:val="Hyperlink"/>
@@ -47,7 +47,7 @@
       <w:r>
         <w:t xml:space="preserve">Every episode can also be played or downloaded as an MP3 at </w:t>
       </w:r>
-      <w:hyperlink w:history="1" r:id="rIdoeaxtxb55avgt74wsby7_">
+      <w:hyperlink w:history="1" r:id="rIdd5of4b4kddwtzwbw5x8ve">
         <w:r>
           <w:rPr>
             <w:rStyle w:val="Hyperlink"/>
@@ -75,7 +75,7 @@
       </w:r>
     </w:p>
     <w:p>
-      <w:hyperlink w:history="1" r:id="rIdbneefor_irki0d2gj7mtu">
+      <w:hyperlink w:history="1" r:id="rId-myskts9i1pbpobnt3q0j">
         <w:r>
           <w:rPr>
             <w:rStyle w:val="Hyperlink"/>
@@ -98,7 +98,7 @@
       </w:r>
     </w:p>
     <w:p>
-      <w:hyperlink w:history="1" r:id="rIdqv3nz5cvpqwfswrsxk7r9">
+      <w:hyperlink w:history="1" r:id="rIdsxea6ibk3kywttfmabzhm">
         <w:r>
           <w:rPr>
             <w:rStyle w:val="Hyperlink"/>
@@ -126,7 +126,7 @@
       </w:r>
     </w:p>
     <w:p>
-      <w:hyperlink w:history="1" r:id="rIdvqpt1vda2cwijusa0cctr">
+      <w:hyperlink w:history="1" r:id="rIdbo-poxbcikrogdxhvhabo">
         <w:r>
           <w:rPr>
             <w:rStyle w:val="Hyperlink"/>
@@ -154,7 +154,7 @@
       </w:r>
     </w:p>
     <w:p>
-      <w:hyperlink w:history="1" r:id="rIdewgxzzv4yvs9uo0n3g_yt">
+      <w:hyperlink w:history="1" r:id="rIdlneumzicur9plhypzpdeb">
         <w:r>
           <w:rPr>
             <w:rStyle w:val="Hyperlink"/>
@@ -182,7 +182,7 @@
       </w:r>
     </w:p>
     <w:p>
-      <w:hyperlink w:history="1" r:id="rIdy7ijzyywwobq2hwss8usx">
+      <w:hyperlink w:history="1" r:id="rIdo6l-zl8hsp3sv-r2sdmbb">
         <w:r>
           <w:rPr>
             <w:rStyle w:val="Hyperlink"/>
@@ -210,7 +210,7 @@
       </w:r>
     </w:p>
     <w:p>
-      <w:hyperlink w:history="1" r:id="rIdz2spmy2bbrjy5urtfvixb">
+      <w:hyperlink w:history="1" r:id="rIdxaetxodgnshw_rnz78orh">
         <w:r>
           <w:rPr>
             <w:rStyle w:val="Hyperlink"/>
@@ -238,7 +238,7 @@
       </w:r>
     </w:p>
     <w:p>
-      <w:hyperlink w:history="1" r:id="rId0inadtz7aw86o4ifzzlxe">
+      <w:hyperlink w:history="1" r:id="rId5pjhhsxtuui1ztrldd1kd">
         <w:r>
           <w:rPr>
             <w:rStyle w:val="Hyperlink"/>
@@ -266,7 +266,7 @@
       </w:r>
     </w:p>
     <w:p>
-      <w:hyperlink w:history="1" r:id="rIdfmrwtnq4fyddsxfptftdf">
+      <w:hyperlink w:history="1" r:id="rIdx-e8mfho7isegrknwoefq">
         <w:r>
           <w:rPr>
             <w:rStyle w:val="Hyperlink"/>
@@ -294,7 +294,7 @@
       </w:r>
     </w:p>
     <w:p>
-      <w:hyperlink w:history="1" r:id="rIdwspcx9xorrvhhgbyud2eh">
+      <w:hyperlink w:history="1" r:id="rIdfjpyx_kyv21vfly8q5uog">
         <w:r>
           <w:rPr>
             <w:rStyle w:val="Hyperlink"/>
@@ -322,12 +322,40 @@
       </w:r>
     </w:p>
     <w:p>
-      <w:hyperlink w:history="1" r:id="rId2blinffk-8wyouiydwhdu">
+      <w:hyperlink w:history="1" r:id="rIdvrl-eeysd3kkiufzahx19">
         <w:r>
           <w:rPr>
             <w:rStyle w:val="Hyperlink"/>
           </w:rPr>
           <w:t xml:space="preserve">https://youtu.be/GyuNAJZ8wgM</w:t>
+        </w:r>
+      </w:hyperlink>
+    </w:p>
+    <w:p>
+      <w:pPr>
+        <w:pStyle w:val="Heading2"/>
+      </w:pPr>
+      <w:r>
+        <w:t xml:space="preserve">Episode 9: The Blind Priest (Leviticus 21)</w:t>
+      </w:r>
+    </w:p>
+    <w:p>
+      <w:r>
+        <w:t xml:space="preserve">About 20 minutes. The third of four on the Law.</w:t>
+      </w:r>
+    </w:p>
+    <w:p>
+      <w:r>
+        <w:t xml:space="preserve">The only law in the Bible that limits what a blind person may do: a blind priest could not approach the altar. Brian asks three practical questions, and the old books answer them.</w:t>
+      </w:r>
+    </w:p>
+    <w:p>
+      <w:hyperlink w:history="1" r:id="rIdncysrnpafd1ghj70upvnw">
+        <w:r>
+          <w:rPr>
+            <w:rStyle w:val="Hyperlink"/>
+          </w:rPr>
+          <w:t xml:space="preserve">https://youtu.be/9FmVwmxZHSg</w:t>
         </w:r>
       </w:hyperlink>
     </w:p>

</xml_diff>

<commit_message>
Episode 10 posted on the site (Unlisted on YouTube, not in the playlist); the Law series is complete
Co-Authored-By: Claude Opus 5.5 <noreply@anthropic.com>
</commit_message>
<xml_diff>
--- a/audio/episodes/youtube_links_for_email.docx
+++ b/audio/episodes/youtube_links_for_email.docx
@@ -3,7 +3,7 @@
 <w:document xmlns:wpc="http://schemas.microsoft.com/office/word/2010/wordprocessingCanvas" xmlns:mc="http://schemas.openxmlformats.org/markup-compatibility/2006" xmlns:o="urn:schemas-microsoft-com:office:office" xmlns:r="http://schemas.openxmlformats.org/officeDocument/2006/relationships" xmlns:m="http://schemas.openxmlformats.org/officeDocument/2006/math" xmlns:v="urn:schemas-microsoft-com:vml" xmlns:wp14="http://schemas.microsoft.com/office/word/2010/wordprocessingDrawing" xmlns:wp="http://schemas.openxmlformats.org/drawingml/2006/wordprocessingDrawing" xmlns:w10="urn:schemas-microsoft-com:office:word" xmlns:w="http://schemas.openxmlformats.org/wordprocessingml/2006/main" xmlns:w14="http://schemas.microsoft.com/office/word/2010/wordml" xmlns:w15="http://schemas.microsoft.com/office/word/2012/wordml" xmlns:wpg="http://schemas.microsoft.com/office/word/2010/wordprocessingGroup" xmlns:wpi="http://schemas.microsoft.com/office/word/2010/wordprocessingInk" xmlns:wne="http://schemas.microsoft.com/office/word/2006/wordml" xmlns:wps="http://schemas.microsoft.com/office/word/2010/wordprocessingShape" xmlns:cx="http://schemas.microsoft.com/office/drawing/2014/chartex" xmlns:cx1="http://schemas.microsoft.com/office/drawing/2015/9/8/chartex" xmlns:cx2="http://schemas.microsoft.com/office/drawing/2015/10/21/chartex" xmlns:cx3="http://schemas.microsoft.com/office/drawing/2016/5/9/chartex" xmlns:cx4="http://schemas.microsoft.com/office/drawing/2016/5/10/chartex" xmlns:cx5="http://schemas.microsoft.com/office/drawing/2016/5/11/chartex" xmlns:cx6="http://schemas.microsoft.com/office/drawing/2016/5/12/chartex" xmlns:cx7="http://schemas.microsoft.com/office/drawing/2016/5/13/chartex" xmlns:cx8="http://schemas.microsoft.com/office/drawing/2016/5/14/chartex" xmlns:aink="http://schemas.microsoft.com/office/drawing/2016/ink" xmlns:am3d="http://schemas.microsoft.com/office/drawing/2017/model3d" xmlns:w16cex="http://schemas.microsoft.com/office/word/2018/wordml/cex" xmlns:w16cid="http://schemas.microsoft.com/office/word/2016/wordml/cid" xmlns:w16="http://schemas.microsoft.com/office/word/2018/wordml" xmlns:w16sdtdh="http://schemas.microsoft.com/office/word/2020/wordml/sdtdatahash" xmlns:w16se="http://schemas.microsoft.com/office/word/2015/wordml/symex" mc:Ignorable="w14 w15 wp14">
   <w:body>
     <w:p>
-      <w:hyperlink w:history="1" r:id="rIdlibmhlpeof1dyb8g7jn1k">
+      <w:hyperlink w:history="1" r:id="rId5mesval_o2szuxssoo779">
         <w:r>
           <w:rPr>
             <w:rStyle w:val="Hyperlink"/>
@@ -34,7 +34,7 @@
       <w:r>
         <w:t xml:space="preserve">The full study, with every verse and source, is at </w:t>
       </w:r>
-      <w:hyperlink w:history="1" r:id="rId7ykyhr77whk6cujsnflwo">
+      <w:hyperlink w:history="1" r:id="rIdjpq0_3uug7xtd-oegjgdh">
         <w:r>
           <w:rPr>
             <w:rStyle w:val="Hyperlink"/>
@@ -47,7 +47,7 @@
       <w:r>
         <w:t xml:space="preserve">Every episode can also be played or downloaded as an MP3 at </w:t>
       </w:r>
-      <w:hyperlink w:history="1" r:id="rIdd5of4b4kddwtzwbw5x8ve">
+      <w:hyperlink w:history="1" r:id="rId2c1ypdy_yf5xmcb2tqw9e">
         <w:r>
           <w:rPr>
             <w:rStyle w:val="Hyperlink"/>
@@ -75,7 +75,7 @@
       </w:r>
     </w:p>
     <w:p>
-      <w:hyperlink w:history="1" r:id="rId-myskts9i1pbpobnt3q0j">
+      <w:hyperlink w:history="1" r:id="rIdqbivkbsdphdymjbobw-oa">
         <w:r>
           <w:rPr>
             <w:rStyle w:val="Hyperlink"/>
@@ -98,7 +98,7 @@
       </w:r>
     </w:p>
     <w:p>
-      <w:hyperlink w:history="1" r:id="rIdsxea6ibk3kywttfmabzhm">
+      <w:hyperlink w:history="1" r:id="rIdxl6fufwwuu89sr6dfvks2">
         <w:r>
           <w:rPr>
             <w:rStyle w:val="Hyperlink"/>
@@ -126,7 +126,7 @@
       </w:r>
     </w:p>
     <w:p>
-      <w:hyperlink w:history="1" r:id="rIdbo-poxbcikrogdxhvhabo">
+      <w:hyperlink w:history="1" r:id="rId4okxfd5kjbhg6i582cxer">
         <w:r>
           <w:rPr>
             <w:rStyle w:val="Hyperlink"/>
@@ -154,7 +154,7 @@
       </w:r>
     </w:p>
     <w:p>
-      <w:hyperlink w:history="1" r:id="rIdlneumzicur9plhypzpdeb">
+      <w:hyperlink w:history="1" r:id="rId9bxlm4nz-xdvmkywuhqto">
         <w:r>
           <w:rPr>
             <w:rStyle w:val="Hyperlink"/>
@@ -182,7 +182,7 @@
       </w:r>
     </w:p>
     <w:p>
-      <w:hyperlink w:history="1" r:id="rIdo6l-zl8hsp3sv-r2sdmbb">
+      <w:hyperlink w:history="1" r:id="rIdi8vyjripleualn3b0k6rk">
         <w:r>
           <w:rPr>
             <w:rStyle w:val="Hyperlink"/>
@@ -210,7 +210,7 @@
       </w:r>
     </w:p>
     <w:p>
-      <w:hyperlink w:history="1" r:id="rIdxaetxodgnshw_rnz78orh">
+      <w:hyperlink w:history="1" r:id="rIdxk4ftfkbvz1k5xzjsbpa2">
         <w:r>
           <w:rPr>
             <w:rStyle w:val="Hyperlink"/>
@@ -238,7 +238,7 @@
       </w:r>
     </w:p>
     <w:p>
-      <w:hyperlink w:history="1" r:id="rId5pjhhsxtuui1ztrldd1kd">
+      <w:hyperlink w:history="1" r:id="rIdysibzogmhc6hupsssg_u0">
         <w:r>
           <w:rPr>
             <w:rStyle w:val="Hyperlink"/>
@@ -266,7 +266,7 @@
       </w:r>
     </w:p>
     <w:p>
-      <w:hyperlink w:history="1" r:id="rIdx-e8mfho7isegrknwoefq">
+      <w:hyperlink w:history="1" r:id="rIdgbpi85u22udwfz9uqf_cb">
         <w:r>
           <w:rPr>
             <w:rStyle w:val="Hyperlink"/>
@@ -294,7 +294,7 @@
       </w:r>
     </w:p>
     <w:p>
-      <w:hyperlink w:history="1" r:id="rIdfjpyx_kyv21vfly8q5uog">
+      <w:hyperlink w:history="1" r:id="rIdmbn_dtj5lzz_-yuzcedqh">
         <w:r>
           <w:rPr>
             <w:rStyle w:val="Hyperlink"/>
@@ -322,7 +322,7 @@
       </w:r>
     </w:p>
     <w:p>
-      <w:hyperlink w:history="1" r:id="rIdvrl-eeysd3kkiufzahx19">
+      <w:hyperlink w:history="1" r:id="rIdexcuqfhr31qmheuon9fs5">
         <w:r>
           <w:rPr>
             <w:rStyle w:val="Hyperlink"/>
@@ -350,12 +350,40 @@
       </w:r>
     </w:p>
     <w:p>
-      <w:hyperlink w:history="1" r:id="rIdncysrnpafd1ghj70upvnw">
+      <w:hyperlink w:history="1" r:id="rIdiikveahodjk2wayitgbgj">
         <w:r>
           <w:rPr>
             <w:rStyle w:val="Hyperlink"/>
           </w:rPr>
           <w:t xml:space="preserve">https://youtu.be/9FmVwmxZHSg</w:t>
+        </w:r>
+      </w:hyperlink>
+    </w:p>
+    <w:p>
+      <w:pPr>
+        <w:pStyle w:val="Heading2"/>
+      </w:pPr>
+      <w:r>
+        <w:t xml:space="preserve">Episode 10: The Blind Animal and the Altar (Leviticus 22, Deuteronomy 15 and Malachi 1)</w:t>
+      </w:r>
+    </w:p>
+    <w:p>
+      <w:r>
+        <w:t xml:space="preserve">About 23 minutes. The last of four on the Law.</w:t>
+      </w:r>
+    </w:p>
+    <w:p>
+      <w:r>
+        <w:t xml:space="preserve">No blind animal may be offered to the LORD. Brian found it the hardest law to read, because it seems to call blindness broken. Two Hebrew words, a market in the Temple and a prophet's test answer him.</w:t>
+      </w:r>
+    </w:p>
+    <w:p>
+      <w:hyperlink w:history="1" r:id="rIdsnt-12bswhv8klxlm7k_p">
+        <w:r>
+          <w:rPr>
+            <w:rStyle w:val="Hyperlink"/>
+          </w:rPr>
+          <w:t xml:space="preserve">https://youtu.be/q5G-9tuPQ00</w:t>
         </w:r>
       </w:hyperlink>
     </w:p>

</xml_diff>

<commit_message>
Episode 11 posted on the site (Unlisted on YouTube, not in the playlist); the sight-lost series begins
Co-Authored-By: Claude Fable 5.1 <noreply@anthropic.com>
</commit_message>
<xml_diff>
--- a/audio/episodes/youtube_links_for_email.docx
+++ b/audio/episodes/youtube_links_for_email.docx
@@ -27,7 +27,7 @@
     </w:p>
     <w:p>
       <w:r>
-        <w:t xml:space="preserve">There are six episodes on the stories of sight given by Jesus in the Gospels, and a short trailer. Episode 7 begins a new series of four on the Law: what God commanded about the blind. The Law episodes have no imagined scenes.</w:t>
+        <w:t xml:space="preserve">There are six episodes on the stories of sight given by Jesus in the Gospels, and a short trailer. Episode 7 begins a new series of four on the Law: what God commanded about the blind. The Law episodes have no imagined scenes. Episode 11 begins a series of six on sight lost and not given back.</w:t>
       </w:r>
     </w:p>
     <w:p>
@@ -384,6 +384,34 @@
             <w:rStyle w:val="Hyperlink"/>
           </w:rPr>
           <w:t xml:space="preserve">https://youtu.be/q5G-9tuPQ00</w:t>
+        </w:r>
+      </w:hyperlink>
+    </w:p>
+    <w:p>
+      <w:pPr>
+        <w:pStyle w:val="Heading2"/>
+      </w:pPr>
+      <w:r>
+        <w:t xml:space="preserve">Episode 11: The Last Thing He Saw (2 Kings 25, Jeremiah 34 and 38, Ezekiel 12)</w:t>
+      </w:r>
+    </w:p>
+    <w:p>
+      <w:r>
+        <w:t xml:space="preserve">About 25 minutes. The first of six on sight lost and not given back.</w:t>
+      </w:r>
+    </w:p>
+    <w:p>
+      <w:r>
+        <w:t xml:space="preserve">Zedekiah, the last king in Jerusalem, was made to watch his sons die and then blinded, so that it would be the last thing he ever saw. The episode opens with sound, what God made it to do and the sounds a blind man cannot unhear, then follows the frightened king who kept sending for Jeremiah in secret, the night escape through the gate between the two walls, Riblah told only as the text tells it, the road to Babylon, and the one promise he did not have to earn. Brian tells for the first time what the months of trying to save his eyes were like.</w:t>
+      </w:r>
+    </w:p>
+    <w:p>
+      <w:hyperlink w:history="1" r:id="rIdsnt-12bswhv8klxlm7k_p">
+        <w:r>
+          <w:rPr>
+            <w:rStyle w:val="Hyperlink"/>
+          </w:rPr>
+          <w:t xml:space="preserve">https://youtu.be/Xhx44nR_OLM</w:t>
         </w:r>
       </w:hyperlink>
     </w:p>

</xml_diff>